<commit_message>
feat(reports): add REVIEWING status, article_image and article_bonus_money to LineItem
</commit_message>
<xml_diff>
--- a/app/modules/reports/templates/acceptance_report.docx
+++ b/app/modules/reports/templates/acceptance_report.docx
@@ -437,7 +437,7 @@
           <w:szCs w:val="26"/>
           <w:rtl w:val="0"/>
         </w:rPr>
-        <w:t xml:space="preserve">Tài khoản số             : {creator_bank_account_number}</w:t>
+        <w:t xml:space="preserve">Tài khoản số            : {creator_bank_account_number}</w:t>
       </w:r>
     </w:p>
     <w:p>
@@ -458,7 +458,7 @@
           <w:szCs w:val="26"/>
           <w:rtl w:val="0"/>
         </w:rPr>
-        <w:t xml:space="preserve">Ngân hàng                 : {creator_bank}</w:t>
+        <w:t xml:space="preserve">Ngân hàng               : {creator_bank}</w:t>
       </w:r>
     </w:p>
     <w:p>
@@ -479,7 +479,7 @@
           <w:szCs w:val="26"/>
           <w:rtl w:val="0"/>
         </w:rPr>
-        <w:t xml:space="preserve">Chi nhánh                  : {creatir_bank_branch} </w:t>
+        <w:t xml:space="preserve">Chi nhánh                : {creator_bank_branch} </w:t>
       </w:r>
     </w:p>
     <w:p>
@@ -1009,18 +1009,22 @@
         <w:tblLook w:val="0400"/>
       </w:tblPr>
       <w:tblGrid>
-        <w:gridCol w:w="1515"/>
-        <w:gridCol w:w="1440"/>
-        <w:gridCol w:w="1560"/>
-        <w:gridCol w:w="2220"/>
-        <w:gridCol w:w="2550"/>
+        <w:gridCol w:w="977.8779979144942"/>
+        <w:gridCol w:w="929.4681960375391"/>
+        <w:gridCol w:w="1006.9238790406673"/>
+        <w:gridCol w:w="1432.9301355578727"/>
+        <w:gridCol w:w="1645.9332638164753"/>
+        <w:gridCol w:w="1645.9332638164753"/>
+        <w:gridCol w:w="1645.9332638164753"/>
         <w:tblGridChange w:id="0">
           <w:tblGrid>
-            <w:gridCol w:w="1515"/>
-            <w:gridCol w:w="1440"/>
-            <w:gridCol w:w="1560"/>
-            <w:gridCol w:w="2220"/>
-            <w:gridCol w:w="2550"/>
+            <w:gridCol w:w="977.8779979144942"/>
+            <w:gridCol w:w="929.4681960375391"/>
+            <w:gridCol w:w="1006.9238790406673"/>
+            <w:gridCol w:w="1432.9301355578727"/>
+            <w:gridCol w:w="1645.9332638164753"/>
+            <w:gridCol w:w="1645.9332638164753"/>
+            <w:gridCol w:w="1645.9332638164753"/>
           </w:tblGrid>
         </w:tblGridChange>
       </w:tblGrid>
@@ -1164,6 +1168,60 @@
             </w:r>
           </w:p>
         </w:tc>
+        <w:tc>
+          <w:tcPr/>
+          <w:p>
+            <w:pPr>
+              <w:widowControl w:val="0"/>
+              <w:spacing w:after="60" w:before="60" w:line="288" w:lineRule="auto"/>
+              <w:rPr>
+                <w:rFonts w:ascii="Times New Roman" w:cs="Times New Roman" w:eastAsia="Times New Roman" w:hAnsi="Times New Roman"/>
+                <w:b w:val="1"/>
+                <w:bCs w:val="1"/>
+                <w:sz w:val="26"/>
+                <w:szCs w:val="26"/>
+              </w:rPr>
+            </w:pPr>
+            <w:r>
+              <w:rPr>
+                <w:rFonts w:ascii="Times New Roman" w:cs="Times New Roman" w:eastAsia="Times New Roman" w:hAnsi="Times New Roman"/>
+                <w:b w:val="1"/>
+                <w:bCs w:val="1"/>
+                <w:sz w:val="26"/>
+                <w:szCs w:val="26"/>
+                <w:rtl w:val="0"/>
+              </w:rPr>
+              <w:t xml:space="preserve">Ảnh minh chứng</w:t>
+            </w:r>
+          </w:p>
+        </w:tc>
+        <w:tc>
+          <w:tcPr/>
+          <w:p>
+            <w:pPr>
+              <w:widowControl w:val="0"/>
+              <w:spacing w:after="60" w:before="60" w:line="288" w:lineRule="auto"/>
+              <w:rPr>
+                <w:rFonts w:ascii="Times New Roman" w:cs="Times New Roman" w:eastAsia="Times New Roman" w:hAnsi="Times New Roman"/>
+                <w:b w:val="1"/>
+                <w:bCs w:val="1"/>
+                <w:sz w:val="26"/>
+                <w:szCs w:val="26"/>
+              </w:rPr>
+            </w:pPr>
+            <w:r>
+              <w:rPr>
+                <w:rFonts w:ascii="Times New Roman" w:cs="Times New Roman" w:eastAsia="Times New Roman" w:hAnsi="Times New Roman"/>
+                <w:b w:val="1"/>
+                <w:bCs w:val="1"/>
+                <w:sz w:val="26"/>
+                <w:szCs w:val="26"/>
+                <w:rtl w:val="0"/>
+              </w:rPr>
+              <w:t xml:space="preserve">Tiền thưởng lượt xem</w:t>
+            </w:r>
+          </w:p>
+        </w:tc>
       </w:tr>
       <w:tr>
         <w:trPr>
@@ -1292,6 +1350,54 @@
                 <w:rtl w:val="0"/>
               </w:rPr>
               <w:t xml:space="preserve">{article_view}</w:t>
+            </w:r>
+          </w:p>
+        </w:tc>
+        <w:tc>
+          <w:tcPr/>
+          <w:p>
+            <w:pPr>
+              <w:widowControl w:val="0"/>
+              <w:spacing w:after="60" w:before="60" w:line="288" w:lineRule="auto"/>
+              <w:jc w:val="both"/>
+              <w:rPr>
+                <w:rFonts w:ascii="Times New Roman" w:cs="Times New Roman" w:eastAsia="Times New Roman" w:hAnsi="Times New Roman"/>
+                <w:sz w:val="26"/>
+                <w:szCs w:val="26"/>
+              </w:rPr>
+            </w:pPr>
+            <w:r>
+              <w:rPr>
+                <w:rFonts w:ascii="Times New Roman" w:cs="Times New Roman" w:eastAsia="Times New Roman" w:hAnsi="Times New Roman"/>
+                <w:sz w:val="26"/>
+                <w:szCs w:val="26"/>
+                <w:rtl w:val="0"/>
+              </w:rPr>
+              <w:t xml:space="preserve">{article_image}</w:t>
+            </w:r>
+          </w:p>
+        </w:tc>
+        <w:tc>
+          <w:tcPr/>
+          <w:p>
+            <w:pPr>
+              <w:widowControl w:val="0"/>
+              <w:spacing w:after="60" w:before="60" w:line="288" w:lineRule="auto"/>
+              <w:jc w:val="both"/>
+              <w:rPr>
+                <w:rFonts w:ascii="Times New Roman" w:cs="Times New Roman" w:eastAsia="Times New Roman" w:hAnsi="Times New Roman"/>
+                <w:sz w:val="26"/>
+                <w:szCs w:val="26"/>
+              </w:rPr>
+            </w:pPr>
+            <w:r>
+              <w:rPr>
+                <w:rFonts w:ascii="Times New Roman" w:cs="Times New Roman" w:eastAsia="Times New Roman" w:hAnsi="Times New Roman"/>
+                <w:sz w:val="26"/>
+                <w:szCs w:val="26"/>
+                <w:rtl w:val="0"/>
+              </w:rPr>
+              <w:t xml:space="preserve">{article_bonus_money}</w:t>
             </w:r>
           </w:p>
         </w:tc>

</xml_diff>